<commit_message>
fix(gemini): prioritize fast gemini models, fallback key for cloud, tighten FAQ matching
</commit_message>
<xml_diff>
--- a/StudyGenie_AI_Project_Report.docx
+++ b/StudyGenie_AI_Project_Report.docx
@@ -6156,7 +6156,7 @@
           <w:color w:val="334155"/>
           <w:sz w:val="23"/>
         </w:rPr>
-        <w:t>4.3.3 Activity Diagram: Dynamic Quiz Lifecycle</w:t>
+        <w:t>4.3.3 Activity Diagrams</w:t>
       </w:r>
     </w:p>
     <w:p>
@@ -6169,7 +6169,450 @@
           <w:color w:val="1E293B"/>
           <w:sz w:val="22"/>
         </w:rPr>
-        <w:t>When the student clicks 'Generate Quiz on this Topic', the system routes through topic extraction, dynamic prompt construction, answer evaluation, and immediate progress logging.</w:t>
+        <w:t>Activity diagrams in UML model the sequential and concurrent procedural workflows of the system components:</w:t>
+      </w:r>
+    </w:p>
+    <w:p>
+      <w:pPr>
+        <w:spacing w:before="0" w:after="120" w:line="276" w:lineRule="auto"/>
+      </w:pPr>
+      <w:r>
+        <w:rPr>
+          <w:rFonts w:ascii="Calibri" w:hAnsi="Calibri"/>
+          <w:color w:val="1E293B"/>
+          <w:sz w:val="22"/>
+        </w:rPr>
+        <w:t>1. Overall System Lifecycle &amp; Navigation Activity Diagram:</w:t>
+      </w:r>
+    </w:p>
+    <w:tbl>
+      <w:tblPr>
+        <w:tblW w:type="auto" w:w="0"/>
+        <w:jc w:val="center"/>
+        <w:tblLook w:firstColumn="1" w:firstRow="1" w:lastColumn="0" w:lastRow="0" w:noHBand="0" w:noVBand="1" w:val="04A0"/>
+      </w:tblPr>
+      <w:tblGrid>
+        <w:gridCol w:w="9360"/>
+      </w:tblGrid>
+      <w:tr>
+        <w:tc>
+          <w:tcPr>
+            <w:tcW w:type="dxa" w:w="9360"/>
+            <w:shd w:fill="0F172A"/>
+            <w:tcMar>
+              <w:top w:w="160" w:type="dxa"/>
+              <w:bottom w:w="160" w:type="dxa"/>
+              <w:left w:w="200" w:type="dxa"/>
+              <w:right w:w="200" w:type="dxa"/>
+            </w:tcMar>
+          </w:tcPr>
+          <w:p>
+            <w:pPr>
+              <w:spacing w:before="0" w:after="0" w:line="240" w:lineRule="auto"/>
+            </w:pPr>
+            <w:r>
+              <w:rPr>
+                <w:rFonts w:ascii="Consolas" w:hAnsi="Consolas"/>
+                <w:color w:val="38BDF8"/>
+                <w:sz w:val="17"/>
+              </w:rPr>
+              <w:t xml:space="preserve">  (*)</w:t>
+              <w:br/>
+              <w:t xml:space="preserve">   |</w:t>
+              <w:br/>
+              <w:t xml:space="preserve">   v</w:t>
+              <w:br/>
+              <w:t>[Launch Application]</w:t>
+              <w:br/>
+              <w:t xml:space="preserve">   |</w:t>
+              <w:br/>
+              <w:t xml:space="preserve">   v</w:t>
+              <w:br/>
+              <w:t>&lt;User Authenticated?&gt;</w:t>
+              <w:br/>
+              <w:t xml:space="preserve">  /                 \</w:t>
+              <w:br/>
+              <w:t xml:space="preserve"> (No)              (Yes)</w:t>
+              <w:br/>
+              <w:t xml:space="preserve">  /                   \</w:t>
+              <w:br/>
+              <w:t>[Display Login Modal]  v</w:t>
+              <w:br/>
+              <w:t xml:space="preserve">  |              [Load Saved Session (JWT)]</w:t>
+              <w:br/>
+              <w:t>[Submit Credentials]   |</w:t>
+              <w:br/>
+              <w:t xml:space="preserve">  |                    |</w:t>
+              <w:br/>
+              <w:t>&lt;Auth Valid?&gt;          |</w:t>
+              <w:br/>
+              <w:t xml:space="preserve">  /       \            |</w:t>
+              <w:br/>
+              <w:t xml:space="preserve"> (No)    (Yes)         |</w:t>
+              <w:br/>
+              <w:t xml:space="preserve">  |        \           |</w:t>
+              <w:br/>
+              <w:t>[Error]     +---------&gt;+</w:t>
+              <w:br/>
+              <w:t xml:space="preserve">                       |</w:t>
+              <w:br/>
+              <w:t xml:space="preserve">                       v</w:t>
+              <w:br/>
+              <w:t xml:space="preserve">            [Render Main Dashboard]</w:t>
+              <w:br/>
+              <w:t xml:space="preserve">                       |</w:t>
+              <w:br/>
+              <w:t xml:space="preserve">     +-----------------+-----------------+-----------------+</w:t>
+              <w:br/>
+              <w:t xml:space="preserve">     |                 |                 |                 |</w:t>
+              <w:br/>
+              <w:t xml:space="preserve">     v                 v                 v                 v</w:t>
+              <w:br/>
+              <w:t>[Study Planner]  [Doubt Solver]   [Smart Notes]    [Quiz Engine]</w:t>
+              <w:br/>
+              <w:t xml:space="preserve">     |                 |                 |                 |</w:t>
+              <w:br/>
+              <w:t xml:space="preserve">     +-----------------+-----------------+-----------------+</w:t>
+              <w:br/>
+              <w:t xml:space="preserve">                       |</w:t>
+              <w:br/>
+              <w:t xml:space="preserve">                       v</w:t>
+              <w:br/>
+              <w:t xml:space="preserve">             [Update Activity Progress]</w:t>
+              <w:br/>
+              <w:t xml:space="preserve">                       |</w:t>
+              <w:br/>
+              <w:t xml:space="preserve">                       v</w:t>
+              <w:br/>
+              <w:t xml:space="preserve">                      (*)</w:t>
+            </w:r>
+          </w:p>
+        </w:tc>
+      </w:tr>
+    </w:tbl>
+    <w:p>
+      <w:pPr>
+        <w:spacing w:before="80" w:after="240"/>
+        <w:jc w:val="center"/>
+      </w:pPr>
+      <w:r>
+        <w:rPr>
+          <w:rFonts w:ascii="Calibri" w:hAnsi="Calibri"/>
+          <w:i/>
+          <w:color w:val="64748B"/>
+          <w:sz w:val="19"/>
+        </w:rPr>
+        <w:t>Figure 4.4: Overall System Lifecycle Activity Diagram</w:t>
+      </w:r>
+    </w:p>
+    <w:p>
+      <w:pPr>
+        <w:spacing w:before="0" w:after="120" w:line="276" w:lineRule="auto"/>
+      </w:pPr>
+      <w:r>
+        <w:rPr>
+          <w:rFonts w:ascii="Calibri" w:hAnsi="Calibri"/>
+          <w:color w:val="1E293B"/>
+          <w:sz w:val="22"/>
+        </w:rPr>
+        <w:t>2. Multimodal Academic Doubt Solver Activity Diagram (FR3 &amp; FR4):</w:t>
+      </w:r>
+    </w:p>
+    <w:tbl>
+      <w:tblPr>
+        <w:tblW w:type="auto" w:w="0"/>
+        <w:jc w:val="center"/>
+        <w:tblLook w:firstColumn="1" w:firstRow="1" w:lastColumn="0" w:lastRow="0" w:noHBand="0" w:noVBand="1" w:val="04A0"/>
+      </w:tblPr>
+      <w:tblGrid>
+        <w:gridCol w:w="9360"/>
+      </w:tblGrid>
+      <w:tr>
+        <w:tc>
+          <w:tcPr>
+            <w:tcW w:type="dxa" w:w="9360"/>
+            <w:shd w:fill="0F172A"/>
+            <w:tcMar>
+              <w:top w:w="160" w:type="dxa"/>
+              <w:bottom w:w="160" w:type="dxa"/>
+              <w:left w:w="200" w:type="dxa"/>
+              <w:right w:w="200" w:type="dxa"/>
+            </w:tcMar>
+          </w:tcPr>
+          <w:p>
+            <w:pPr>
+              <w:spacing w:before="0" w:after="0" w:line="240" w:lineRule="auto"/>
+            </w:pPr>
+            <w:r>
+              <w:rPr>
+                <w:rFonts w:ascii="Consolas" w:hAnsi="Consolas"/>
+                <w:color w:val="38BDF8"/>
+                <w:sz w:val="17"/>
+              </w:rPr>
+              <w:t xml:space="preserve">  (*)</w:t>
+              <w:br/>
+              <w:t xml:space="preserve">   |</w:t>
+              <w:br/>
+              <w:t xml:space="preserve">   v</w:t>
+              <w:br/>
+              <w:t>[User Inputs Text Query OR Snaps Camera Photo]</w:t>
+              <w:br/>
+              <w:t xml:space="preserve">   |</w:t>
+              <w:br/>
+              <w:t xml:space="preserve">   v</w:t>
+              <w:br/>
+              <w:t>&lt;Is Photo Attached?&gt;</w:t>
+              <w:br/>
+              <w:t xml:space="preserve">   |-- (Yes) -&gt; [Extract Image Base64 / Prepare Multimodal Payload] --+</w:t>
+              <w:br/>
+              <w:t xml:space="preserve">   |                                                                  |</w:t>
+              <w:br/>
+              <w:t xml:space="preserve">   +-- (No)  -&gt; [Normalize String: strip punctuation, lowercase]      |</w:t>
+              <w:br/>
+              <w:t xml:space="preserve">                      |                                               |</w:t>
+              <w:br/>
+              <w:t xml:space="preserve">                      v                                               |</w:t>
+              <w:br/>
+              <w:t xml:space="preserve">         &lt;Auto-FAQ Cache Similarity &gt;= 85%?&gt;                          |</w:t>
+              <w:br/>
+              <w:t xml:space="preserve">            /                           \                             |</w:t>
+              <w:br/>
+              <w:t xml:space="preserve">          (Yes)                         (No)                          |</w:t>
+              <w:br/>
+              <w:t xml:space="preserve">           /                              \                           |</w:t>
+              <w:br/>
+              <w:t>[Fetch Cached Solution]                    +--------------------------+</w:t>
+              <w:br/>
+              <w:t xml:space="preserve">           |                                           |</w:t>
+              <w:br/>
+              <w:t xml:space="preserve">           |                                           v</w:t>
+              <w:br/>
+              <w:t xml:space="preserve">           |                        [Call Gemini API (8-Second Timer)]</w:t>
+              <w:br/>
+              <w:t xml:space="preserve">           |                                           |</w:t>
+              <w:br/>
+              <w:t xml:space="preserve">           |                           &lt;Response Valid within 8s?&gt;</w:t>
+              <w:br/>
+              <w:t xml:space="preserve">           |                              /                  \</w:t>
+              <w:br/>
+              <w:t xml:space="preserve">           |                            (Yes)                (No / 503 Timeout)</w:t>
+              <w:br/>
+              <w:t xml:space="preserve">           |                             /                      \</w:t>
+              <w:br/>
+              <w:t xml:space="preserve">           |                   [Parse JSON Schema]   [Engage Topic Academic Engine]</w:t>
+              <w:br/>
+              <w:t xml:space="preserve">           |                             \                      /</w:t>
+              <w:br/>
+              <w:t xml:space="preserve">           |                              +----------+---------+</w:t>
+              <w:br/>
+              <w:t xml:space="preserve">           |                                         |</w:t>
+              <w:br/>
+              <w:t xml:space="preserve">           |                                         v</w:t>
+              <w:br/>
+              <w:t xml:space="preserve">           |                             [Save Question &amp; Answer to DB]</w:t>
+              <w:br/>
+              <w:t xml:space="preserve">           |                                         |</w:t>
+              <w:br/>
+              <w:t xml:space="preserve">           +--------------------+--------------------+</w:t>
+              <w:br/>
+              <w:t xml:space="preserve">                                |</w:t>
+              <w:br/>
+              <w:t xml:space="preserve">                                v</w:t>
+              <w:br/>
+              <w:t xml:space="preserve">               [Render KaTeX Formula + Explanations]</w:t>
+              <w:br/>
+              <w:t xml:space="preserve">                                |</w:t>
+              <w:br/>
+              <w:t xml:space="preserve">                                v</w:t>
+              <w:br/>
+              <w:t xml:space="preserve">                &lt;User Clicks 'Generate Quiz'?&gt;</w:t>
+              <w:br/>
+              <w:t xml:space="preserve">                   /                      \</w:t>
+              <w:br/>
+              <w:t xml:space="preserve">                 (Yes)                   (No)</w:t>
+              <w:br/>
+              <w:t xml:space="preserve">                  /                         \</w:t>
+              <w:br/>
+              <w:t xml:space="preserve">     [Propagate Doubt Topic]                 v</w:t>
+              <w:br/>
+              <w:t xml:space="preserve">                  |                         (*)</w:t>
+              <w:br/>
+              <w:t xml:space="preserve">                  v</w:t>
+              <w:br/>
+              <w:t xml:space="preserve">       [Open Dynamic Quiz Modal]</w:t>
+              <w:br/>
+              <w:t xml:space="preserve">                  |</w:t>
+              <w:br/>
+              <w:t xml:space="preserve">                  v</w:t>
+              <w:br/>
+              <w:t xml:space="preserve">                 (*)</w:t>
+            </w:r>
+          </w:p>
+        </w:tc>
+      </w:tr>
+    </w:tbl>
+    <w:p>
+      <w:pPr>
+        <w:spacing w:before="80" w:after="240"/>
+        <w:jc w:val="center"/>
+      </w:pPr>
+      <w:r>
+        <w:rPr>
+          <w:rFonts w:ascii="Calibri" w:hAnsi="Calibri"/>
+          <w:i/>
+          <w:color w:val="64748B"/>
+          <w:sz w:val="19"/>
+        </w:rPr>
+        <w:t>Figure 4.5: Academic Doubt Resolution Activity Diagram</w:t>
+      </w:r>
+    </w:p>
+    <w:p>
+      <w:pPr>
+        <w:spacing w:before="0" w:after="120" w:line="276" w:lineRule="auto"/>
+      </w:pPr>
+      <w:r>
+        <w:rPr>
+          <w:rFonts w:ascii="Calibri" w:hAnsi="Calibri"/>
+          <w:color w:val="1E293B"/>
+          <w:sz w:val="22"/>
+        </w:rPr>
+        <w:t>3. Dynamic Topic Quiz Generation &amp; Evaluation Activity Diagram (FR6):</w:t>
+      </w:r>
+    </w:p>
+    <w:tbl>
+      <w:tblPr>
+        <w:tblW w:type="auto" w:w="0"/>
+        <w:jc w:val="center"/>
+        <w:tblLook w:firstColumn="1" w:firstRow="1" w:lastColumn="0" w:lastRow="0" w:noHBand="0" w:noVBand="1" w:val="04A0"/>
+      </w:tblPr>
+      <w:tblGrid>
+        <w:gridCol w:w="9360"/>
+      </w:tblGrid>
+      <w:tr>
+        <w:tc>
+          <w:tcPr>
+            <w:tcW w:type="dxa" w:w="9360"/>
+            <w:shd w:fill="0F172A"/>
+            <w:tcMar>
+              <w:top w:w="160" w:type="dxa"/>
+              <w:bottom w:w="160" w:type="dxa"/>
+              <w:left w:w="200" w:type="dxa"/>
+              <w:right w:w="200" w:type="dxa"/>
+            </w:tcMar>
+          </w:tcPr>
+          <w:p>
+            <w:pPr>
+              <w:spacing w:before="0" w:after="0" w:line="240" w:lineRule="auto"/>
+            </w:pPr>
+            <w:r>
+              <w:rPr>
+                <w:rFonts w:ascii="Consolas" w:hAnsi="Consolas"/>
+                <w:color w:val="38BDF8"/>
+                <w:sz w:val="17"/>
+              </w:rPr>
+              <w:t xml:space="preserve">  (*)</w:t>
+              <w:br/>
+              <w:t xml:space="preserve">   |</w:t>
+              <w:br/>
+              <w:t xml:space="preserve">   v</w:t>
+              <w:br/>
+              <w:t>[User Triggers 'Generate Quiz on this Topic' (or selects topic in QuizModal)]</w:t>
+              <w:br/>
+              <w:t xml:space="preserve">   |</w:t>
+              <w:br/>
+              <w:t xml:space="preserve">   v</w:t>
+              <w:br/>
+              <w:t>[Initialize QuizModal State: setTopicInput, clearPreviousQuiz]</w:t>
+              <w:br/>
+              <w:t xml:space="preserve">   |</w:t>
+              <w:br/>
+              <w:t xml:space="preserve">   v</w:t>
+              <w:br/>
+              <w:t>[Send POST /api/quiz/generate { topic, difficulty }]</w:t>
+              <w:br/>
+              <w:t xml:space="preserve">   |</w:t>
+              <w:br/>
+              <w:t xml:space="preserve">   v</w:t>
+              <w:br/>
+              <w:t>&lt;Gemini Cloud API Responds?&gt;</w:t>
+              <w:br/>
+              <w:t xml:space="preserve">   /                       \</w:t>
+              <w:br/>
+              <w:t xml:space="preserve"> (Yes)                     (No / Timeout)</w:t>
+              <w:br/>
+              <w:t xml:space="preserve">  /                           \</w:t>
+              <w:br/>
+              <w:t>[Parse 4-Option MCQs]   [Synthesize Topic Knowledge MCQs]</w:t>
+              <w:br/>
+              <w:t xml:space="preserve">  \                           /</w:t>
+              <w:br/>
+              <w:t xml:space="preserve">   +-------------+-----------+</w:t>
+              <w:br/>
+              <w:t xml:space="preserve">                 |</w:t>
+              <w:br/>
+              <w:t xml:space="preserve">                 v</w:t>
+              <w:br/>
+              <w:t xml:space="preserve">   [Render Interactive Questions Q1..Q4]</w:t>
+              <w:br/>
+              <w:t xml:space="preserve">                 |</w:t>
+              <w:br/>
+              <w:t xml:space="preserve">                 v</w:t>
+              <w:br/>
+              <w:t xml:space="preserve">   [User Selects Multiple Choice Answers]</w:t>
+              <w:br/>
+              <w:t xml:space="preserve">                 |</w:t>
+              <w:br/>
+              <w:t xml:space="preserve">                 v</w:t>
+              <w:br/>
+              <w:t xml:space="preserve">   [User Clicks 'Submit Quiz &amp; Evaluate']</w:t>
+              <w:br/>
+              <w:t xml:space="preserve">                 |</w:t>
+              <w:br/>
+              <w:t xml:space="preserve">                 v</w:t>
+              <w:br/>
+              <w:t xml:space="preserve">   [POST /api/quiz/:id/submit { userAnswers }]</w:t>
+              <w:br/>
+              <w:t xml:space="preserve">                 |</w:t>
+              <w:br/>
+              <w:t xml:space="preserve">                 v</w:t>
+              <w:br/>
+              <w:t xml:space="preserve">   [Calculate Score, Percentage &amp; Breakdown]</w:t>
+              <w:br/>
+              <w:t xml:space="preserve">                 |</w:t>
+              <w:br/>
+              <w:t xml:space="preserve">                 v</w:t>
+              <w:br/>
+              <w:t xml:space="preserve">   [Display Trophy Banner, Highlighting &amp; Explanations]</w:t>
+              <w:br/>
+              <w:t xml:space="preserve">                 |</w:t>
+              <w:br/>
+              <w:t xml:space="preserve">                 v</w:t>
+              <w:br/>
+              <w:t xml:space="preserve">   [Log Quiz Results to Progress Dashboard]</w:t>
+              <w:br/>
+              <w:t xml:space="preserve">                 |</w:t>
+              <w:br/>
+              <w:t xml:space="preserve">                 v</w:t>
+              <w:br/>
+              <w:t xml:space="preserve">                (*)</w:t>
+            </w:r>
+          </w:p>
+        </w:tc>
+      </w:tr>
+    </w:tbl>
+    <w:p>
+      <w:pPr>
+        <w:spacing w:before="80" w:after="240"/>
+        <w:jc w:val="center"/>
+      </w:pPr>
+      <w:r>
+        <w:rPr>
+          <w:rFonts w:ascii="Calibri" w:hAnsi="Calibri"/>
+          <w:i/>
+          <w:color w:val="64748B"/>
+          <w:sz w:val="19"/>
+        </w:rPr>
+        <w:t>Figure 4.6: Dynamic Quiz Lifecycle Activity Diagram</w:t>
       </w:r>
     </w:p>
     <w:p>

</xml_diff>